<commit_message>
Update speaker notes for slides 1a, 1b, and 2a with detailed explanations and refined hypotheses. Adjusted content for clarity on model comparisons and human biases, emphasizing the impact of scale on results and the absence of a universal "most human-like" model.
</commit_message>
<xml_diff>
--- a/slides/results_1a_1b_2a_speaker_notes.docx
+++ b/slides/results_1a_1b_2a_speaker_notes.docx
@@ -61,7 +61,7 @@
         <w:pStyle w:val="FirstParagraph"/>
       </w:pPr>
       <w:r>
-        <w:t xml:space="preserve">这里我简单交代一下路线图，方便大家在后面定位。前半部分是研究 1a，核心是中英文差距背后的诊断逻辑；中间部分是研究 1b 和 2a，重点是最小配对设计下的人机性别偏差；最后两节分别讨论人机题项级相似度，也就是 ICC，以及跨尺度稳健性，也就是 CS。最后我会回到所有假设，给出一个尽量清晰的综合结论。</w:t>
+        <w:t xml:space="preserve">这里我简单交代一下路线图，方便大家在后面定位。前半部分是研究 1a，核心是中英文差距背后的诊断逻辑；中间部分是研究 1b 和 2a，重点是最小配对设计下的人机性别偏差；最后两节我会先讨论与 1b 的 H1b.3 对位的跨尺度相似性，也就是 CS，再在这个前提上讨论同尺度内哪个模型最像人，也就是 ICC。最后我会回到所有假设，给出一个尽量清晰的综合结论。</w:t>
       </w:r>
     </w:p>
     <w:bookmarkEnd w:id="22"/>
@@ -486,21 +486,21 @@
       </w:r>
     </w:p>
     <w:bookmarkEnd w:id="44"/>
-    <w:bookmarkStart w:id="45" w:name="第26页研究-1b跨模型-d_z-在任意两尺度间贴近对角线排序稳定滑块仅稍放大"/>
-    <w:p>
-      <w:pPr>
-        <w:pStyle w:val="Heading2"/>
-      </w:pPr>
-      <w:r>
-        <w:t xml:space="preserve">第26页｜研究 1b：跨模型 d_z 在任意两尺度间贴近对角线——排序稳定，滑块仅稍放大</w:t>
-      </w:r>
-    </w:p>
-    <w:p>
-      <w:pPr>
-        <w:pStyle w:val="FirstParagraph"/>
-      </w:pPr>
-      <w:r>
-        <w:t xml:space="preserve">这张散点图就是对刚才第一条规律的量化表达。每一个点都是一个模型，点越靠近对角线，就说明它在两种尺度下的相对位置越稳定。整体来看，点确实贴得比较近，所以“谁更偏、谁更不偏”这件事在跨尺度上是相当稳的。滑块相对会让部分模型略高一点，但这个偏移没有改写整体排序。</w:t>
+    <w:bookmarkStart w:id="45" w:name="第26页研究-1b固定同一个模型看三尺度下的-10-维-d_z-向量有多像自己"/>
+    <w:p>
+      <w:pPr>
+        <w:pStyle w:val="Heading2"/>
+      </w:pPr>
+      <w:r>
+        <w:t xml:space="preserve">第26页｜研究 1b：固定同一个模型看，三尺度下的 10 维 d_z 向量有多像自己？</w:t>
+      </w:r>
+    </w:p>
+    <w:p>
+      <w:pPr>
+        <w:pStyle w:val="FirstParagraph"/>
+      </w:pPr>
+      <w:r>
+        <w:t xml:space="preserve">这一页我想测试的是：固定同一个模型，它换一种尺度之后，偏差结构还像不像它自己。这里每一行就是一个模型，三列分别是三对尺度之间、基于 10 个一级领域 d_z 向量算出来的 Spearman 相关。这样读下来会很直观。GPT-5.1、Kimi、Llama 和 Qwen 在三对尺度上都维持中等到较高的正相关，说明这些模型换尺度之后，大体还是在同一批维度上更偏。Claude 和 DeepSeek V3.2 则明显不稳定，甚至出现负相关，表示一种尺度下最偏的维度，换到另一种尺度后可能就不再靠前。Gemma 和 DeepSeek R1 则属于“局部稳定”，只在某一对尺度上相似。也就是说，真正重要的不是跨模型比较，而是不同模型在跨尺度上的自我一致性差异很大。</w:t>
       </w:r>
     </w:p>
     <w:bookmarkEnd w:id="45"/>
@@ -932,53 +932,203 @@
         <w:pStyle w:val="FirstParagraph"/>
       </w:pPr>
       <w:r>
-        <w:t xml:space="preserve">所以 2a 的小结可以说得很清楚。人类重复了模型端的主效应，也重复了“性化加外貌”这两个共同热区；更进一步，人类内部还表现出非常稳健的被试性别差异，而且这个差异明显大于尺度差异。到这里为止，如果我们只看方向和总体强度，人机其实是相当一致的。真正的问题从下一节才开始出现，也就是“哪一个模型最像人”到底有没有稳定答案。</w:t>
+        <w:t xml:space="preserve">所以 2a 的小结可以说得很清楚。人类重复了模型端的主效应，也重复了“性化加外貌”这两个共同热区；更进一步，人类内部还表现出非常稳健的被试性别差异，而且这个差异明显大于尺度差异。到这里为止，如果我们只看方向和总体强度，人机其实是相当一致的。接下来我会先回到和 1b 的 H1b.3 对位的问题，也就是人类自己在三种尺度之间到底稳不稳；在这个前提厘清之后，再讨论“哪个模型最像人”。</w:t>
       </w:r>
     </w:p>
     <w:bookmarkEnd w:id="67"/>
-    <w:bookmarkStart w:id="68" w:name="第49页研究-2aicc研究问题与设计"/>
-    <w:p>
-      <w:pPr>
-        <w:pStyle w:val="Heading2"/>
-      </w:pPr>
-      <w:r>
-        <w:t xml:space="preserve">第49页｜研究 2a·ICC：研究问题与设计</w:t>
-      </w:r>
-    </w:p>
-    <w:p>
-      <w:pPr>
-        <w:pStyle w:val="FirstParagraph"/>
-      </w:pPr>
-      <w:r>
-        <w:t xml:space="preserve">进入 ICC 这一节之后，我的问题会变得更细。前面我们已经知道，人和模型都把女人版打得更高，但这并不等于它们会在同一批题项上做出相同判断。所以这里我用每一道题的偏差向量去比较人和模型，看哪一个模型在题项级最接近人类。</w:t>
+    <w:bookmarkStart w:id="68" w:name="第49页研究-2acs研究问题与设计"/>
+    <w:p>
+      <w:pPr>
+        <w:pStyle w:val="Heading2"/>
+      </w:pPr>
+      <w:r>
+        <w:t xml:space="preserve">第49页｜研究 2a·CS：研究问题与设计</w:t>
+      </w:r>
+    </w:p>
+    <w:p>
+      <w:pPr>
+        <w:pStyle w:val="FirstParagraph"/>
+      </w:pPr>
+      <w:r>
+        <w:t xml:space="preserve">这一节我会明确把它和 1b 的 H1b.3 对齐来讲。1b 已经告诉我们，在模型端，</w:t>
+      </w:r>
+      <w:r>
+        <w:t xml:space="preserve">“</w:t>
+      </w:r>
+      <w:r>
+        <w:t xml:space="preserve">三种尺度是不是在测同一件事</w:t>
+      </w:r>
+      <w:r>
+        <w:t xml:space="preserve">”</w:t>
+      </w:r>
+      <w:r>
+        <w:t xml:space="preserve">必须按层级分开回答；所以到了 2a，最自然的下一步不是先问哪个模型最像人，而是先问人类自己跨尺度稳不稳。如果人类自己在 3 点、7 点和滑块之间就会明显重排，那后面的 ICC 结果就必须在这个前提下解释，而不能直接拿来当作模型“不像人”的证据。</w:t>
       </w:r>
     </w:p>
     <w:bookmarkEnd w:id="68"/>
-    <w:bookmarkStart w:id="69" w:name="第50页研究-2aicc三条假设"/>
-    <w:p>
-      <w:pPr>
-        <w:pStyle w:val="Heading2"/>
-      </w:pPr>
-      <w:r>
-        <w:t xml:space="preserve">第50页｜研究 2a·ICC：三条假设</w:t>
-      </w:r>
-    </w:p>
-    <w:p>
-      <w:pPr>
-        <w:pStyle w:val="FirstParagraph"/>
-      </w:pPr>
-      <w:r>
-        <w:t xml:space="preserve">这一页的三条假设分别对应三个层次的判断。第一条是存在一个普适的模型，在不同的被试群体以及不同尺度下，相比于其它LLM都更像人。这种可能性是存在的，或许是源自于预训练的语料更充分，又或许是模型的参数量更大；第二条与之相反，认为“最像人”的模型会随着被试群体和尺度改变；第三条则提出一个直觉性的推测，即如果某个子群的整体效应量更大，那么它和模型的题项级模式也许会更一致。</w:t>
+    <w:bookmarkStart w:id="69" w:name="第50页研究-2acs两条假设"/>
+    <w:p>
+      <w:pPr>
+        <w:pStyle w:val="Heading2"/>
+      </w:pPr>
+      <w:r>
+        <w:t xml:space="preserve">第50页｜研究 2a·CS：两条假设</w:t>
+      </w:r>
+    </w:p>
+    <w:p>
+      <w:pPr>
+        <w:pStyle w:val="FirstParagraph"/>
+      </w:pPr>
+      <w:r>
+        <w:t xml:space="preserve">这里的两条假设，其实就是把 1b 的跨尺度问题带回到人类端。第一条假设是，人类本身在跨尺度上就不会太稳，因为量表形式、锚点和认知负担都可能改变“哪一道题更偏”的排序；第二条假设则更偏向常见的模型优越论，认为 LLM 也许能比人类更稳定地把同一判断映射到不同尺度上。后面大家会看到，第一条基本成立，第二条则并没有得到支持。</w:t>
       </w:r>
     </w:p>
     <w:bookmarkEnd w:id="69"/>
-    <w:bookmarkStart w:id="70" w:name="第51页研究-2aicc5-个不同模型在-9-个单元轮流登顶不存在普适最像人模型"/>
-    <w:p>
-      <w:pPr>
-        <w:pStyle w:val="Heading2"/>
-      </w:pPr>
-      <w:r>
-        <w:t xml:space="preserve">第51页｜研究 2a·ICC：5 个不同模型在 9 个单元轮流登顶——不存在普适“最像人”模型</w:t>
+    <w:bookmarkStart w:id="70" w:name="第51页研究-2acs人类三个被试群体在三对尺度上的-ρ-都很低"/>
+    <w:p>
+      <w:pPr>
+        <w:pStyle w:val="Heading2"/>
+      </w:pPr>
+      <w:r>
+        <w:t xml:space="preserve">第51页｜研究 2a·CS：人类三个被试群体在三对尺度上的 ρ 都很低</w:t>
+      </w:r>
+    </w:p>
+    <w:p>
+      <w:pPr>
+        <w:pStyle w:val="FirstParagraph"/>
+      </w:pPr>
+      <w:r>
+        <w:t xml:space="preserve">这一页我先只看人类自己，而且用一个最直接的表来读。三行分别是全体、男性和女性被试，三列分别是三对尺度之间的 Spearman 相关。结论非常清楚：9 个单元全部低于 0.13。这意味着人类自己一旦换一种量表，</w:t>
+      </w:r>
+      <w:r>
+        <w:t xml:space="preserve">“</w:t>
+      </w:r>
+      <w:r>
+        <w:t xml:space="preserve">哪一道题更偏</w:t>
+      </w:r>
+      <w:r>
+        <w:t xml:space="preserve">”</w:t>
+      </w:r>
+      <w:r>
+        <w:t xml:space="preserve">的排序就会明显重组。也就是说，跨尺度不稳定并不是模型独有的问题，人类自己也并没有那么稳。</w:t>
+      </w:r>
+    </w:p>
+    <w:bookmarkEnd w:id="70"/>
+    <w:bookmarkStart w:id="71" w:name="第52页研究-2acs人机并列森林中位-ρ-同量级模型间分化更大"/>
+    <w:p>
+      <w:pPr>
+        <w:pStyle w:val="Heading2"/>
+      </w:pPr>
+      <w:r>
+        <w:t xml:space="preserve">第52页｜研究 2a·CS：人机并列森林——中位 ρ 同量级，模型间分化更大</w:t>
+      </w:r>
+    </w:p>
+    <w:p>
+      <w:pPr>
+        <w:pStyle w:val="FirstParagraph"/>
+      </w:pPr>
+      <w:r>
+        <w:t xml:space="preserve">这一页把人类和模型放到同一张图里。最重要的不是谁的中位数略高一点，而是两边总体上处在同一个量级。换句话说，模型并没有表现出一种明显高于人类的跨尺度稳健性。真正更大的差别，反而出现在模型内部的离散程度上，也就是有些模型相对稳定，有些模型非常不稳定。</w:t>
+      </w:r>
+    </w:p>
+    <w:bookmarkEnd w:id="71"/>
+    <w:bookmarkStart w:id="72" w:name="Xbbae52d99b8e7cb6eda6413b5dac3a652513213"/>
+    <w:p>
+      <w:pPr>
+        <w:pStyle w:val="Heading2"/>
+      </w:pPr>
+      <w:r>
+        <w:t xml:space="preserve">第53页｜研究 2a·CS：LLM 与人类跨尺度相关相近，但模型间分化更大——H2a.CS.2 不支持</w:t>
+      </w:r>
+    </w:p>
+    <w:p>
+      <w:pPr>
+        <w:pStyle w:val="FirstParagraph"/>
+      </w:pPr>
+      <w:r>
+        <w:t xml:space="preserve">这一页我会把判决说得很直接：H2a.CS.2，也就是“LLM 显著比人类更稳健”这个假设，不支持。尤其在 3 点对 7 点这一组上，LLM 的中位相关甚至还低于人类。也就是说，题项级跨尺度重组不是人类独有的噪声，也不是模型天然可以克服的问题。真正值得解释的是，为什么模型内部会出现这么大的分化。</w:t>
+      </w:r>
+    </w:p>
+    <w:bookmarkEnd w:id="72"/>
+    <w:bookmarkStart w:id="73" w:name="X27f2343af61147c3e36a432d5c3b5e7105088c9"/>
+    <w:p>
+      <w:pPr>
+        <w:pStyle w:val="Heading2"/>
+      </w:pPr>
+      <w:r>
+        <w:t xml:space="preserve">第54页｜研究 2a·CS：聚合级 +0.86/+0.72/+0.58 复刻 LLM 端排序——人机共识</w:t>
+      </w:r>
+    </w:p>
+    <w:p>
+      <w:pPr>
+        <w:pStyle w:val="FirstParagraph"/>
+      </w:pPr>
+      <w:r>
+        <w:t xml:space="preserve">这一页非常关键，因为它把刚才题项级的低相关，和更高一层的聚合结果放到了一起。题项级上，人和模型都不太稳；但到了 10 个一级领域的聚合层，人类全体样本给出的三对排序几乎完全复刻了 LLM 端。也就是说，人机在“大类结构”上是有共识的，只是在细到具体题项时会显著分化。这也再次说明，跨尺度相似性必须分层解读。</w:t>
+      </w:r>
+    </w:p>
+    <w:bookmarkEnd w:id="73"/>
+    <w:bookmarkStart w:id="74" w:name="第55页研究-2acs-小结题项级上人机都受尺度影响在领域层面人机结果相似"/>
+    <w:p>
+      <w:pPr>
+        <w:pStyle w:val="Heading2"/>
+      </w:pPr>
+      <w:r>
+        <w:t xml:space="preserve">第55页｜研究 2a·CS 小结：题项级上人机都受尺度影响；在领域层面人机结果相似</w:t>
+      </w:r>
+    </w:p>
+    <w:p>
+      <w:pPr>
+        <w:pStyle w:val="FirstParagraph"/>
+      </w:pPr>
+      <w:r>
+        <w:t xml:space="preserve">所以这一节的结论可以概括成一句话：题项级上，人和模型都很容易受到尺度影响，没有谁天然更稳定；但一旦提升到领域层面的聚合分析，人机又会重新表现出相当一致的模式。从逻辑顺序上讲，这一节其实是后面 ICC 的前提，因为它告诉我们，后面讨论“最像人”时，必须明确限定在同一尺度内，不能把跨尺度的重排和人机不一致混在一起。</w:t>
+      </w:r>
+    </w:p>
+    <w:bookmarkEnd w:id="74"/>
+    <w:bookmarkStart w:id="75" w:name="第56页研究-2aicc研究问题与设计"/>
+    <w:p>
+      <w:pPr>
+        <w:pStyle w:val="Heading2"/>
+      </w:pPr>
+      <w:r>
+        <w:t xml:space="preserve">第56页｜研究 2a·ICC：研究问题与设计</w:t>
+      </w:r>
+    </w:p>
+    <w:p>
+      <w:pPr>
+        <w:pStyle w:val="FirstParagraph"/>
+      </w:pPr>
+      <w:r>
+        <w:t xml:space="preserve">在厘清了上一节这个前提之后，ICC 的问题才真正成立。也就是说，既然人类自己跨尺度就会重排，那么“哪个模型最像人”就不能跨尺度去问，而必须固定在同一种量表里比较。所以这一节我比较的是同一尺度内的人机题项级偏差向量，看哪一个模型在这个限定条件下最接近人类。</w:t>
+      </w:r>
+    </w:p>
+    <w:bookmarkEnd w:id="75"/>
+    <w:bookmarkStart w:id="76" w:name="第57页研究-2aicc三条假设"/>
+    <w:p>
+      <w:pPr>
+        <w:pStyle w:val="Heading2"/>
+      </w:pPr>
+      <w:r>
+        <w:t xml:space="preserve">第57页｜研究 2a·ICC：三条假设</w:t>
+      </w:r>
+    </w:p>
+    <w:p>
+      <w:pPr>
+        <w:pStyle w:val="FirstParagraph"/>
+      </w:pPr>
+      <w:r>
+        <w:t xml:space="preserve">这一页的三条假设分别对应三个层次的判断。第一条是存在一个普适的模型，在不同的被试群体以及不同尺度下，相比于其它LLM都更像人；第二条与之相反，认为“最像人”的模型会随着被试群体和尺度改变；第三条则提出一个直觉性的推测，即如果某个子群的整体效应量更大，那么它和模型的题项级模式也许会更一致。</w:t>
+      </w:r>
+    </w:p>
+    <w:bookmarkEnd w:id="76"/>
+    <w:bookmarkStart w:id="77" w:name="第58页研究-2aicc5-个不同模型在-9-个单元轮流登顶不存在普适最像人模型"/>
+    <w:p>
+      <w:pPr>
+        <w:pStyle w:val="Heading2"/>
+      </w:pPr>
+      <w:r>
+        <w:t xml:space="preserve">第58页｜研究 2a·ICC：5 个不同模型在 9 个单元轮流登顶——不存在普适“最像人”模型</w:t>
       </w:r>
     </w:p>
     <w:p>
@@ -1001,14 +1151,14 @@
         <w:t xml:space="preserve">这个问题本身就是不完整的，除非你同时说明像的是哪一群人、在哪一种尺度上。这个结果直接否定了那种想要找出一个普适“最人类模型”的思路。</w:t>
       </w:r>
     </w:p>
-    <w:bookmarkEnd w:id="70"/>
-    <w:bookmarkStart w:id="71" w:name="X3cba33fa0325428872e9bc6a0b051ce114e12b5"/>
-    <w:p>
-      <w:pPr>
-        <w:pStyle w:val="Heading2"/>
-      </w:pPr>
-      <w:r>
-        <w:t xml:space="preserve">第52页｜研究 2a·ICC：Claude 4.5 于 7 点／滑块胜出——ICC 随尺度分辨率上升</w:t>
+    <w:bookmarkEnd w:id="77"/>
+    <w:bookmarkStart w:id="78" w:name="X64a2dd6f78bdce2a7d09c9c6c3f250babb4a269"/>
+    <w:p>
+      <w:pPr>
+        <w:pStyle w:val="Heading2"/>
+      </w:pPr>
+      <w:r>
+        <w:t xml:space="preserve">第59页｜研究 2a·ICC：Claude 4.5 于 7 点／滑块胜出——ICC 随尺度分辨率上升</w:t>
       </w:r>
     </w:p>
     <w:p>
@@ -1019,14 +1169,14 @@
         <w:t xml:space="preserve">这一页我会把注意力放在尺度本身。全体样本下，随着尺度从 3 点走到 7 点再到滑块，最佳 ICC 是上升的，这说明更细的尺度确实更有助于保留题项级信息。可是与此同时，所有 ICC 仍然都处在 poor 区间，这意味着即便在最有利的条件下，人机题项级的绝对一致性也并不高。所以这里的结论是“在相对更细的尺度上，人机更有机会表现出一点可见的一致”。</w:t>
       </w:r>
     </w:p>
-    <w:bookmarkEnd w:id="71"/>
-    <w:bookmarkStart w:id="72" w:name="Xa8efad7eda179a6bc3cb1666df483382f579f0c"/>
-    <w:p>
-      <w:pPr>
-        <w:pStyle w:val="Heading2"/>
-      </w:pPr>
-      <w:r>
-        <w:t xml:space="preserve">第53页｜研究 2a·ICC：拆开被试性别后 top-1 跳到 GLM／DeepSeek R1／Qwen——不同子群下最相似模型不同</w:t>
+    <w:bookmarkEnd w:id="78"/>
+    <w:bookmarkStart w:id="79" w:name="X3433b7d82c4b3e432188b0b52a447067636c208"/>
+    <w:p>
+      <w:pPr>
+        <w:pStyle w:val="Heading2"/>
+      </w:pPr>
+      <w:r>
+        <w:t xml:space="preserve">第60页｜研究 2a·ICC：拆开被试性别后 top-1 跳到 GLM／DeepSeek R1／Qwen——不同子群下最相似模型不同</w:t>
       </w:r>
     </w:p>
     <w:p>
@@ -1037,14 +1187,14 @@
         <w:t xml:space="preserve">这一页进一步说明，所谓“最像人”不仅受尺度影响，也受被试是谁的影响。把全体样本拆成男女之后，冠军模型就发生了明显切换，这表明不同子群并没有共享同一套最相近的模型原型。对我来说，这个结果尤其重要，因为它提醒我们，人类内部本来就不是单一标准答案。如果“人”本身是多元的，那么模型和“人”的对齐也不可能只有一个固定版本。</w:t>
       </w:r>
     </w:p>
-    <w:bookmarkEnd w:id="72"/>
-    <w:bookmarkStart w:id="73" w:name="第54页研究-2aicc三条主要结论"/>
-    <w:p>
-      <w:pPr>
-        <w:pStyle w:val="Heading2"/>
-      </w:pPr>
-      <w:r>
-        <w:t xml:space="preserve">第54页｜研究 2a·ICC：三条主要结论</w:t>
+    <w:bookmarkEnd w:id="79"/>
+    <w:bookmarkStart w:id="80" w:name="第61页研究-2aicc三条主要结论"/>
+    <w:p>
+      <w:pPr>
+        <w:pStyle w:val="Heading2"/>
+      </w:pPr>
+      <w:r>
+        <w:t xml:space="preserve">第61页｜研究 2a·ICC：三条主要结论</w:t>
       </w:r>
     </w:p>
     <w:p>
@@ -1055,14 +1205,14 @@
         <w:t xml:space="preserve">这一页我会把 ICC 的三条核心结论连起来讲。第一，没有固定的“最像人”模型，top-1 会随着被试子群和尺度改变；第二，尺度越细，题项级相似度越容易上升，但即便如此也仍然停留在 poor 区间；第三，也是最有启发性的一点，女性被试虽然整体 d_z 更大，但题项级上反而不比男性被试更像 LLM。换句话说，整体偏差强，不等于具体题项配置就更接近模型。</w:t>
       </w:r>
     </w:p>
-    <w:bookmarkEnd w:id="73"/>
-    <w:bookmarkStart w:id="74" w:name="第55页研究-2aicc-小结没有固定的最像人模型效应量大不等于题项更一致"/>
-    <w:p>
-      <w:pPr>
-        <w:pStyle w:val="Heading2"/>
-      </w:pPr>
-      <w:r>
-        <w:t xml:space="preserve">第55页｜研究 2a·ICC 小结：没有固定的“最像人”模型，效应量大不等于题项更一致</w:t>
+    <w:bookmarkEnd w:id="80"/>
+    <w:bookmarkStart w:id="81" w:name="第62页研究-2aicc-小结没有固定的最像人模型效应量大不等于题项更一致"/>
+    <w:p>
+      <w:pPr>
+        <w:pStyle w:val="Heading2"/>
+      </w:pPr>
+      <w:r>
+        <w:t xml:space="preserve">第62页｜研究 2a·ICC 小结：没有固定的“最像人”模型，效应量大不等于题项更一致</w:t>
       </w:r>
     </w:p>
     <w:p>
@@ -1071,144 +1221,6 @@
       </w:pPr>
       <w:r>
         <w:t xml:space="preserve">所以在 ICC 小结里，我会提出一个比较谨慎但有解释力的想法，也就是“对齐偏斜”。它的意思不是模型整体上不够像人，而是模型更可能对齐到了某一类评分者的判断结构，比如更接近男性评分者在题项层面的识别方式。这个假设当然还不是直接证明，但它很好地解释了为什么女性被试的整体效应量更大，却没有换来更高的 ICC。也就是说，量级和模式真的是两个彼此独立的维度。</w:t>
-      </w:r>
-    </w:p>
-    <w:bookmarkEnd w:id="74"/>
-    <w:bookmarkStart w:id="75" w:name="第56页研究-2acs研究问题"/>
-    <w:p>
-      <w:pPr>
-        <w:pStyle w:val="Heading2"/>
-      </w:pPr>
-      <w:r>
-        <w:t xml:space="preserve">第56页｜研究 2a·CS：研究问题</w:t>
-      </w:r>
-    </w:p>
-    <w:p>
-      <w:pPr>
-        <w:pStyle w:val="FirstParagraph"/>
-      </w:pPr>
-      <w:r>
-        <w:t xml:space="preserve">上一节结束后，一个自然的问题就是：人机 ICC 低，到底是因为人和模型真的不像，还是因为人类自己跨尺度就不太像。CS 这一节就是为了回答这个前置问题。换句话说，在批评模型“不稳定”之前，我们必须先问清楚，人类自己在 3 点、7 点和滑块之间，是不是也会对同一批题项给出很不一样的偏差排序。只有做完这一步，我们才能公平比较人和模型谁更稳。</w:t>
-      </w:r>
-    </w:p>
-    <w:bookmarkEnd w:id="75"/>
-    <w:bookmarkStart w:id="76" w:name="第57页研究-2acs两条假设"/>
-    <w:p>
-      <w:pPr>
-        <w:pStyle w:val="Heading2"/>
-      </w:pPr>
-      <w:r>
-        <w:t xml:space="preserve">第57页｜研究 2a·CS：两条假设</w:t>
-      </w:r>
-    </w:p>
-    <w:p>
-      <w:pPr>
-        <w:pStyle w:val="FirstParagraph"/>
-      </w:pPr>
-      <w:r>
-        <w:t xml:space="preserve">这里的两条假设分别代表两种常见直觉。第一种直觉是，人类很容易受量表形式、认知负担和锚点效应影响，所以跨尺度不会太稳；第二种直觉则更偏向模型优越论，认为 LLM 作为语言生成系统，也许能更稳定地把同一判断映射到不同尺度上。</w:t>
-      </w:r>
-    </w:p>
-    <w:bookmarkEnd w:id="76"/>
-    <w:bookmarkStart w:id="77" w:name="第58页研究-2acs人类三个被试群体的题项级跨尺度相关均低于-0.13"/>
-    <w:p>
-      <w:pPr>
-        <w:pStyle w:val="Heading2"/>
-      </w:pPr>
-      <w:r>
-        <w:t xml:space="preserve">第58页｜研究 2a·CS：人类三个被试群体的题项级跨尺度相关均低于 0.13</w:t>
-      </w:r>
-    </w:p>
-    <w:p>
-      <w:pPr>
-        <w:pStyle w:val="FirstParagraph"/>
-      </w:pPr>
-      <w:r>
-        <w:t xml:space="preserve">这一页先看人类自己。结果非常清楚，不管是全体、男性还是女性被试，题项级的跨尺度相关都很低，多数置信区间还跨过零。也就是说，对人类而言，同一批题项换一种评分方式之后，</w:t>
-      </w:r>
-      <w:r>
-        <w:t xml:space="preserve">“</w:t>
-      </w:r>
-      <w:r>
-        <w:t xml:space="preserve">哪一题更偏</w:t>
-      </w:r>
-      <w:r>
-        <w:t xml:space="preserve">”</w:t>
-      </w:r>
-      <w:r>
-        <w:t xml:space="preserve">的排序也会大幅重组。所以如果我们后面发现模型跨尺度也不稳，就不能简单把它视为模型独有的问题，因为人类自己本来就没有那么稳。</w:t>
-      </w:r>
-    </w:p>
-    <w:bookmarkEnd w:id="77"/>
-    <w:bookmarkStart w:id="78" w:name="第59页研究-2acs人机并列森林中位-ρ-同量级模型间分化更大"/>
-    <w:p>
-      <w:pPr>
-        <w:pStyle w:val="Heading2"/>
-      </w:pPr>
-      <w:r>
-        <w:t xml:space="preserve">第59页｜研究 2a·CS：人机并列森林——中位 ρ 同量级，模型间分化更大</w:t>
-      </w:r>
-    </w:p>
-    <w:p>
-      <w:pPr>
-        <w:pStyle w:val="FirstParagraph"/>
-      </w:pPr>
-      <w:r>
-        <w:t xml:space="preserve">这一页是把人类和模型放在同一张图上看。最值得注意的是，两边的中位相关其实在同一个量级上，并没有出现模型远远高于人的情况；真正更大的差异，反而出现在模型内部的离散程度上。也就是说，人类跨子群体之间差异有，但模型和模型之间的差异更大。这个结果已经开始动摇“模型比人类更稳定”这一常见印象了。</w:t>
-      </w:r>
-    </w:p>
-    <w:bookmarkEnd w:id="78"/>
-    <w:bookmarkStart w:id="79" w:name="Xd56ed49172e4b4eb375755ef858bb1546f90a28"/>
-    <w:p>
-      <w:pPr>
-        <w:pStyle w:val="Heading2"/>
-      </w:pPr>
-      <w:r>
-        <w:t xml:space="preserve">第60页｜研究 2a·CS：LLM 与人类跨尺度相关相近，但模型间分化更大——H2a.CS.2 不支持</w:t>
-      </w:r>
-    </w:p>
-    <w:p>
-      <w:pPr>
-        <w:pStyle w:val="FirstParagraph"/>
-      </w:pPr>
-      <w:r>
-        <w:t xml:space="preserve">这一页我会直接点明判决：H2a.CS.2 也就是“LLM 显著比人类更稳健”这一假设，不支持。尤其在 3 点对 7 点这一组上，LLM 的中位相关甚至还低于人类。换句话说，题项级跨尺度重组不是人类独有的噪声，也不是模型天然可以克服的问题。真正需要解释的，是为什么有些模型表现得相对稳定，而另一些模型却非常不稳定。</w:t>
-      </w:r>
-    </w:p>
-    <w:bookmarkEnd w:id="79"/>
-    <w:bookmarkStart w:id="80" w:name="Xc37a8e10a4479cae742a7e53326845b82d20bd0"/>
-    <w:p>
-      <w:pPr>
-        <w:pStyle w:val="Heading2"/>
-      </w:pPr>
-      <w:r>
-        <w:t xml:space="preserve">第61页｜研究 2a·CS：聚合级 +0.86/+0.72/+0.58 复刻 LLM 端排序——人机共识</w:t>
-      </w:r>
-    </w:p>
-    <w:p>
-      <w:pPr>
-        <w:pStyle w:val="FirstParagraph"/>
-      </w:pPr>
-      <w:r>
-        <w:t xml:space="preserve">这一页很有意思，因为它再次重现了我们在 1b 看到的分层结构。题项级上，人和模型都不太稳；但到了聚合级，也就是只看 10 个一级领域的 d_z，整体现象又重新收敛，甚至连哪一对尺度最像、哪一对最不像，人的全体样本和模型端都给出非常接近的排序。也就是说，人机在“大类结构”上是有共识的，只是在细到单个题项时会显著分化。</w:t>
-      </w:r>
-    </w:p>
-    <w:bookmarkEnd w:id="80"/>
-    <w:bookmarkStart w:id="81" w:name="第62页研究-2acs-小结题项级上人机都受尺度影响在领域层面人机结果相似"/>
-    <w:p>
-      <w:pPr>
-        <w:pStyle w:val="Heading2"/>
-      </w:pPr>
-      <w:r>
-        <w:t xml:space="preserve">第62页｜研究 2a·CS 小结：题项级上人机都受尺度影响；在领域层面人机结果相似</w:t>
-      </w:r>
-    </w:p>
-    <w:p>
-      <w:pPr>
-        <w:pStyle w:val="FirstParagraph"/>
-      </w:pPr>
-      <w:r>
-        <w:t xml:space="preserve">所以这一节的结论可以概括成一句话：题项级上，人和模型都很容易受到尺度影响，没有谁天然更稳定；但一旦提升到领域层面的聚合分析，人机又会重新表现出相当一致的模式。这其实在统计学上是非常合理的，因为更细的层级会有更多的随机波动，而更粗的层级则会把这些波动平均掉。但从心理学角度看，这也提示我们，人机比较的结论很大程度上取决于我们选择在哪个层级上进行比较。</w:t>
       </w:r>
     </w:p>
     <w:bookmarkEnd w:id="81"/>

</xml_diff>